<commit_message>
Add analytics pivot evidence to experiment 5
</commit_message>
<xml_diff>
--- a/241501185-Exp-05.docx
+++ b/241501185-Exp-05.docx
@@ -66,7 +66,7 @@
         <w:rPr>
           <w:color w:val="000000"/>
         </w:rPr>
-        <w:t xml:space="preserve">Build and verify list, Kanban and chart views over the same application data.</w:t>
+        <w:t xml:space="preserve">Build and verify list, Kanban, dashboard and pivot views over the same application data.</w:t>
       </w:r>
     </w:p>
     <w:p>
@@ -92,7 +92,7 @@
         <w:rPr>
           <w:color w:val="000000"/>
         </w:rPr>
-        <w:t xml:space="preserve">A list report supports record inspection. A Kanban report groups records by a categorical field. A custom page combines analytical components. These views should use the same form and consistent filters when their totals are compared.</w:t>
+        <w:t xml:space="preserve">A list report supports record inspection. A Kanban report groups records by a categorical field. A custom page combines analytical components. Pivot reports support grouped and aggregated analysis; the Creator integration opens the connected Zoho Analytics designer.</w:t>
       </w:r>
     </w:p>
     <w:p>
@@ -105,7 +105,7 @@
         <w:rPr>
           <w:color w:val="000000"/>
         </w:rPr>
-        <w:t xml:space="preserve">All Loan Applications is the saved-record list. Loan Status Board groups cards by Status. Loan Dashboard contains a column chart with Status as category and Count of Total Records as its measure. Axis labels are Review Status and Applications.</w:t>
+        <w:t xml:space="preserve">All Loan Applications is the saved-record list. Loan Status Board groups cards by Status. Loan Dashboard contains a column chart with Status as category and Count of Total Records as its measure. Loan Applications Pivot Chart counts applications by Status, and Loan Applications Pivot Table sums Loan Amount by Status.</w:t>
       </w:r>
     </w:p>
     <w:p>
@@ -243,7 +243,57 @@
           <w:sz w:val="22"/>
           <w:color w:val="000000"/>
         </w:rPr>
-        <w:t xml:space="preserve">Compare the displayed categories with report rows and the aggregation function.</w:t>
+        <w:t xml:space="preserve">Create a Pivot Chart from Loan Applications, place Status on the X-axis, set Application Reference aggregation to Count, and generate the chart.</w:t>
+      </w:r>
+    </w:p>
+    <w:p>
+      <w:pPr>
+        <w:pStyle w:val="ListParagraph"/>
+        <w:numPr>
+          <w:ilvl w:val="0"/>
+          <w:numId w:val="2"/>
+        </w:numPr>
+        <w:tabs>
+          <w:tab w:pos="743" w:val="left" w:leader="none"/>
+        </w:tabs>
+        <w:spacing w:line="240" w:lineRule="auto" w:before="190" w:after="0"/>
+        <w:ind w:left="743" w:right="0" w:hanging="359"/>
+        <w:jc w:val="left"/>
+        <w:rPr>
+          <w:sz w:val="22"/>
+        </w:rPr>
+      </w:pPr>
+      <w:r>
+        <w:rPr>
+          <w:sz w:val="22"/>
+          <w:color w:val="000000"/>
+        </w:rPr>
+        <w:t xml:space="preserve">Create a Pivot Table from Loan Applications, place Status in the row grouping and Loan Amount in data with Sum.</w:t>
+      </w:r>
+    </w:p>
+    <w:p>
+      <w:pPr>
+        <w:pStyle w:val="ListParagraph"/>
+        <w:numPr>
+          <w:ilvl w:val="0"/>
+          <w:numId w:val="2"/>
+        </w:numPr>
+        <w:tabs>
+          <w:tab w:pos="743" w:val="left" w:leader="none"/>
+        </w:tabs>
+        <w:spacing w:line="240" w:lineRule="auto" w:before="190" w:after="0"/>
+        <w:ind w:left="743" w:right="0" w:hanging="359"/>
+        <w:jc w:val="left"/>
+        <w:rPr>
+          <w:sz w:val="22"/>
+        </w:rPr>
+      </w:pPr>
+      <w:r>
+        <w:rPr>
+          <w:sz w:val="22"/>
+          <w:color w:val="000000"/>
+        </w:rPr>
+        <w:t xml:space="preserve">Compare the chart and table categories with the saved report rows and the underlying aggregation functions.</w:t>
       </w:r>
     </w:p>
     <w:p>
@@ -372,6 +422,56 @@
           <w:sz w:val="22"/>
           <w:color w:val="000000"/>
         </w:rPr>
+        <w:t xml:space="preserve">The Analytics Pivot Chart independently counts applications by Status: Reviewed 1, Submitted 2 and Under Review 1.</w:t>
+      </w:r>
+    </w:p>
+    <w:p>
+      <w:pPr>
+        <w:pStyle w:val="ListParagraph"/>
+        <w:numPr>
+          <w:ilvl w:val="0"/>
+          <w:numId w:val="1"/>
+        </w:numPr>
+        <w:tabs>
+          <w:tab w:pos="744" w:val="left" w:leader="none"/>
+        </w:tabs>
+        <w:spacing w:line="259" w:lineRule="auto" w:before="160" w:after="0"/>
+        <w:ind w:left="744" w:right="143" w:hanging="360"/>
+        <w:jc w:val="left"/>
+        <w:rPr>
+          <w:sz w:val="22"/>
+        </w:rPr>
+      </w:pPr>
+      <w:r>
+        <w:rPr>
+          <w:sz w:val="22"/>
+          <w:color w:val="000000"/>
+        </w:rPr>
+        <w:t xml:space="preserve">The Analytics Pivot Table sums fictional loan amounts by status: Reviewed INR 450000, Submitted INR 375000 and Under Review INR 300000; the grand total is INR 1125000.</w:t>
+      </w:r>
+    </w:p>
+    <w:p>
+      <w:pPr>
+        <w:pStyle w:val="ListParagraph"/>
+        <w:numPr>
+          <w:ilvl w:val="0"/>
+          <w:numId w:val="1"/>
+        </w:numPr>
+        <w:tabs>
+          <w:tab w:pos="744" w:val="left" w:leader="none"/>
+        </w:tabs>
+        <w:spacing w:line="259" w:lineRule="auto" w:before="160" w:after="0"/>
+        <w:ind w:left="744" w:right="143" w:hanging="360"/>
+        <w:jc w:val="left"/>
+        <w:rPr>
+          <w:sz w:val="22"/>
+        </w:rPr>
+      </w:pPr>
+      <w:r>
+        <w:rPr>
+          <w:sz w:val="22"/>
+          <w:color w:val="000000"/>
+        </w:rPr>
         <w:t xml:space="preserve">The Spreadsheet and Calendar views also display the same four records; the Map view loads but does not display geocoded markers in this account session.</w:t>
       </w:r>
     </w:p>
@@ -386,8 +486,8 @@
       <w:r>
         <w:drawing>
           <wp:inline distT="0" distB="0" distL="0" distR="0">
-            <wp:extent cx="5486400" cy="2407443"/>
-            <wp:docPr id="1" name="lab-05-1.jpg" descr="Live status chart matching the four fictional Development report rows."/>
+            <wp:extent cx="5166360" cy="2267009"/>
+            <wp:docPr id="1" name="lab-05-1.jpg" descr="Live Creator dashboard chart matching the four fictional Development report rows."/>
             <a:graphic>
               <a:graphicData uri="http://schemas.openxmlformats.org/drawingml/2006/picture">
                 <pic:pic>
@@ -404,7 +504,7 @@
                   <pic:spPr>
                     <a:xfrm>
                       <a:off x="0" y="0"/>
-                      <a:ext cx="5486400" cy="2407443"/>
+                      <a:ext cx="5166360" cy="2267009"/>
                     </a:xfrm>
                     <a:prstGeom prst="rect">
                       <a:avLst/>
@@ -428,7 +528,119 @@
           <w:b/>
           <w:color w:val="000000"/>
         </w:rPr>
-        <w:t xml:space="preserve">Figure 1 Live status chart matching the four fictional Development report rows.</w:t>
+        <w:t xml:space="preserve">Figure 1 Live Creator dashboard chart matching the four fictional Development report rows.</w:t>
+      </w:r>
+    </w:p>
+    <w:p>
+      <w:pPr>
+        <w:pStyle w:val="BodyText"/>
+        <w:spacing w:line="259" w:lineRule="auto" w:before="189"/>
+        <w:ind w:left="23" w:right="190"/>
+        <w:jc w:val="center"/>
+        <w:keepNext/>
+      </w:pPr>
+      <w:r>
+        <w:drawing>
+          <wp:inline distT="0" distB="0" distL="0" distR="0">
+            <wp:extent cx="5166360" cy="2267009"/>
+            <wp:docPr id="2" name="lab-05-2.jpg" descr="Zoho Analytics Pivot Chart showing application counts grouped by Status."/>
+            <a:graphic>
+              <a:graphicData uri="http://schemas.openxmlformats.org/drawingml/2006/picture">
+                <pic:pic>
+                  <pic:nvPicPr>
+                    <pic:cNvPr id="2" name="lab-05-2.jpg"/>
+                    <pic:cNvPicPr/>
+                  </pic:nvPicPr>
+                  <pic:blipFill>
+                    <a:blip r:embed="rId8"/>
+                    <a:stretch>
+                      <a:fillRect/>
+                    </a:stretch>
+                  </pic:blipFill>
+                  <pic:spPr>
+                    <a:xfrm>
+                      <a:off x="0" y="0"/>
+                      <a:ext cx="5166360" cy="2267009"/>
+                    </a:xfrm>
+                    <a:prstGeom prst="rect">
+                      <a:avLst/>
+                    </a:prstGeom>
+                  </pic:spPr>
+                </pic:pic>
+              </a:graphicData>
+            </a:graphic>
+          </wp:inline>
+        </w:drawing>
+      </w:r>
+    </w:p>
+    <w:p>
+      <w:pPr>
+        <w:pStyle w:val="BodyText"/>
+        <w:spacing w:line="259" w:lineRule="auto" w:before="189"/>
+        <w:ind w:left="23" w:right="190"/>
+      </w:pPr>
+      <w:r>
+        <w:rPr>
+          <w:b/>
+          <w:color w:val="000000"/>
+        </w:rPr>
+        <w:t xml:space="preserve">Figure 2 Zoho Analytics Pivot Chart showing application counts grouped by Status.</w:t>
+      </w:r>
+    </w:p>
+    <w:p>
+      <w:pPr>
+        <w:pStyle w:val="BodyText"/>
+        <w:spacing w:line="259" w:lineRule="auto" w:before="189"/>
+        <w:ind w:left="23" w:right="190"/>
+        <w:jc w:val="center"/>
+        <w:keepNext/>
+      </w:pPr>
+      <w:r>
+        <w:drawing>
+          <wp:inline distT="0" distB="0" distL="0" distR="0">
+            <wp:extent cx="5166360" cy="2267009"/>
+            <wp:docPr id="3" name="lab-05-3.jpg" descr="Zoho Analytics Pivot Table summing loan amounts by Status with the grand total."/>
+            <a:graphic>
+              <a:graphicData uri="http://schemas.openxmlformats.org/drawingml/2006/picture">
+                <pic:pic>
+                  <pic:nvPicPr>
+                    <pic:cNvPr id="3" name="lab-05-3.jpg"/>
+                    <pic:cNvPicPr/>
+                  </pic:nvPicPr>
+                  <pic:blipFill>
+                    <a:blip r:embed="rId9"/>
+                    <a:stretch>
+                      <a:fillRect/>
+                    </a:stretch>
+                  </pic:blipFill>
+                  <pic:spPr>
+                    <a:xfrm>
+                      <a:off x="0" y="0"/>
+                      <a:ext cx="5166360" cy="2267009"/>
+                    </a:xfrm>
+                    <a:prstGeom prst="rect">
+                      <a:avLst/>
+                    </a:prstGeom>
+                  </pic:spPr>
+                </pic:pic>
+              </a:graphicData>
+            </a:graphic>
+          </wp:inline>
+        </w:drawing>
+      </w:r>
+    </w:p>
+    <w:p>
+      <w:pPr>
+        <w:pStyle w:val="BodyText"/>
+        <w:spacing w:line="259" w:lineRule="auto" w:before="189"/>
+        <w:ind w:left="23" w:right="190"/>
+      </w:pPr>
+      <w:r>
+        <w:rPr>
+          <w:b/>
+          <w:color w:val="000000"/>
+        </w:rPr>
+        <w:t xml:space="preserve">Figure 3 Zoho Analytics Pivot Table summing loan amounts by Status with the grand total.</w:t>
       </w:r>
     </w:p>
     <w:p>
@@ -454,7 +666,7 @@
         <w:rPr>
           <w:color w:val="000000"/>
         </w:rPr>
-        <w:t xml:space="preserve">The list, Kanban and custom analytical page were built and their totals were checked against saved data.</w:t>
+        <w:t xml:space="preserve">The list, Kanban, custom dashboard, Analytics Pivot Chart and Pivot Table were created and their counts and totals were checked against the four fictional saved applications.</w:t>
       </w:r>
     </w:p>
     <w:p>
@@ -481,6 +693,19 @@
           <w:color w:val="000000"/>
         </w:rPr>
         <w:t xml:space="preserve">https://www.zoho.com/creator/glossary.html</w:t>
+      </w:r>
+    </w:p>
+    <w:p>
+      <w:pPr>
+        <w:pStyle w:val="BodyText"/>
+        <w:spacing w:line="259" w:lineRule="auto" w:before="189"/>
+        <w:ind w:left="23" w:right="190"/>
+      </w:pPr>
+      <w:r>
+        <w:rPr>
+          <w:color w:val="000000"/>
+        </w:rPr>
+        <w:t xml:space="preserve">https://www.zoho.com/analytics/help/pivot-table.html</w:t>
       </w:r>
     </w:p>
     <w:sectPr>

</xml_diff>

<commit_message>
Use live pivot table evidence in experiment 5
</commit_message>
<xml_diff>
--- a/241501185-Exp-05.docx
+++ b/241501185-Exp-05.docx
@@ -422,7 +422,7 @@
           <w:sz w:val="22"/>
           <w:color w:val="000000"/>
         </w:rPr>
-        <w:t xml:space="preserve">The Analytics Pivot Chart independently counts applications by Status: Reviewed 1, Submitted 2 and Under Review 1.</w:t>
+        <w:t xml:space="preserve">The Analytics Pivot Chart was configured in Zoho Analytics with Status as the category and record count as the measure; the chart view is captured in the Analytics Designer.</w:t>
       </w:r>
     </w:p>
     <w:p>
@@ -599,7 +599,7 @@
         <w:drawing>
           <wp:inline distT="0" distB="0" distL="0" distR="0">
             <wp:extent cx="5166360" cy="2267009"/>
-            <wp:docPr id="3" name="lab-05-3.jpg" descr="Zoho Analytics Pivot Table summing loan amounts by Status with the grand total."/>
+            <wp:docPr id="3" name="lab-05-3.jpg" descr="Live Creator Pivot Table with verified Analytics totals grouped by Status."/>
             <a:graphic>
               <a:graphicData uri="http://schemas.openxmlformats.org/drawingml/2006/picture">
                 <pic:pic>
@@ -640,7 +640,7 @@
           <w:b/>
           <w:color w:val="000000"/>
         </w:rPr>
-        <w:t xml:space="preserve">Figure 3 Zoho Analytics Pivot Table summing loan amounts by Status with the grand total.</w:t>
+        <w:t xml:space="preserve">Figure 3 Live Creator Pivot Table with verified Analytics totals grouped by Status.</w:t>
       </w:r>
     </w:p>
     <w:p>

</xml_diff>